<commit_message>
Fix Nancy Avitable asymmetry-protocol naming + Nicolette Scott rescanNote BMI gap
icons-doc-auditor's 8/17 rotation found Nancy Avitable's Day 1 Block C
"Reverse Lunge" named/sequenced to start on the right leg despite her
document's own left-corrective protocol and cue text — renamed to
"Reverse Lunge (Left-Led)" with a matching flag field.

icons-roster-analyst's 8/17 pass confirmed Nicolette Scott's rescanNote
(both full-gym and at-home documents) omitted BMI from the 8-week
tracking list despite BMI being flagged elsewhere as borderline
Underweight — added to both.

All three regenerated docs independently audited: single-field edits
only, nothing else moved.
</commit_message>
<xml_diff>
--- a/clients/nancy_avitable/Nancy_Avitable_3Day_Training_Plan.docx
+++ b/clients/nancy_avitable/Nancy_Avitable_3Day_Training_Plan.docx
@@ -4333,7 +4333,20 @@
                 <w:sz w:val="18"/>
                 <w:szCs w:val="18"/>
               </w:rPr>
-              <w:t xml:space="preserve">Reverse Lunge (Start R to L)</w:t>
+              <w:t xml:space="preserve">Reverse Lunge (Left-Led)</w:t>
+            </w:r>
+          </w:p>
+          <w:p>
+            <w:r>
+              <w:rPr>
+                <w:rFonts w:ascii="Arial" w:cs="Arial" w:eastAsia="Arial" w:hAnsi="Arial"/>
+                <w:i/>
+                <w:iCs/>
+                <w:color w:val="B71C1C"/>
+                <w:sz w:val="14"/>
+                <w:szCs w:val="14"/>
+              </w:rPr>
+              <w:t xml:space="preserve">Left corrective</w:t>
             </w:r>
           </w:p>
         </w:tc>

</xml_diff>

<commit_message>
Add perimenopausal-status-ambiguity note to Nancy Avitable's document
Roster-wide research-coverage sweep (women 20-45 bracket) found her
document had no note addressing CLAUDE.md's Perimenopausal Status
screening-ambiguity guidance, unlike Kayma Liburd's document which
already carries one. Added a matching teal note; isPostmenopausal stays
false, correctly reflecting nothing reported at intake rather than an
age-based assumption. Independently audited clean: single paragraph
insertion, nothing else moved.
</commit_message>
<xml_diff>
--- a/clients/nancy_avitable/Nancy_Avitable_3Day_Training_Plan.docx
+++ b/clients/nancy_avitable/Nancy_Avitable_3Day_Training_Plan.docx
@@ -2235,6 +2235,31 @@
           <w:szCs w:val="17"/>
         </w:rPr>
         <w:t xml:space="preserve">No exercise literally named "Split Squat" exists in Nancy's program. Weighted Step-Up (Day 3 Block A, a primary-strength-block loaded unilateral knee-dominant movement) is the closest analogous slot — closer than Day 1's Reverse Lunge or Day 3's Curtsy Lunge, both of which are deliberately light, corrective-context finishers where a heavier baseline-derived load would work against their actual purpose. The DB Split Squat baseline (17.5 lbs/hand → 20 lbs/hand) is used to inform Weighted Step-Up's Week 1 → Week 4 load on that basis.</w:t>
+      </w:r>
+    </w:p>
+    <w:p>
+      <w:pPr>
+        <w:spacing w:after="100"/>
+      </w:pPr>
+      <w:r>
+        <w:rPr>
+          <w:rFonts w:ascii="Arial" w:cs="Arial" w:eastAsia="Arial" w:hAnsi="Arial"/>
+          <w:b/>
+          <w:bCs/>
+          <w:color w:val="00695C"/>
+          <w:sz w:val="17"/>
+          <w:szCs w:val="17"/>
+        </w:rPr>
+        <w:t xml:space="preserve">Perimenopausal Status — Not Assessed at Intake:  </w:t>
+      </w:r>
+      <w:r>
+        <w:rPr>
+          <w:rFonts w:ascii="Arial" w:cs="Arial" w:eastAsia="Arial" w:hAnsi="Arial"/>
+          <w:color w:val="2C2C2C"/>
+          <w:sz w:val="17"/>
+          <w:szCs w:val="17"/>
+        </w:rPr>
+        <w:t xml:space="preserve">No menstrual irregularity, vasomotor symptoms (hot flashes/night sweats), sleep disruption, or mood-change data was reported at intake. Per CLAUDE.md's "Perimenopausal Status — Screening Ambiguity in a Non-Clinical Context" guidance, perimenopausal symptoms can begin in the early-to-mid 30s, well before the ~45 average onset — "she's too young for this" is not a safe assumption to bring into a 35-45 bracket intake. Nancy is 38; isPostmenopausal is correctly left false since nothing was reported, not assumed false by age. Revisit if symptom data becomes available at a future session.</w:t>
       </w:r>
     </w:p>
     <w:p>

</xml_diff>

<commit_message>
Add rich activation/accessory content from Jason's SOAP notes to Siobhan, Nancy; document Kelly's anti-valgus protocol
</commit_message>
<xml_diff>
--- a/clients/nancy_avitable/Nancy_Avitable_3Day_Training_Plan.docx
+++ b/clients/nancy_avitable/Nancy_Avitable_3Day_Training_Plan.docx
@@ -2289,6 +2289,31 @@
     </w:p>
     <w:p>
       <w:pPr>
+        <w:spacing w:after="100"/>
+      </w:pPr>
+      <w:r>
+        <w:rPr>
+          <w:rFonts w:ascii="Arial" w:cs="Arial" w:eastAsia="Arial" w:hAnsi="Arial"/>
+          <w:b/>
+          <w:bCs/>
+          <w:color w:val="43A047"/>
+          <w:sz w:val="17"/>
+          <w:szCs w:val="17"/>
+        </w:rPr>
+        <w:t xml:space="preserve">PT Update — 8/12/2026 Session, Additional Activation &amp; Accessory Detail (Jason Bethea):  </w:t>
+      </w:r>
+      <w:r>
+        <w:rPr>
+          <w:rFonts w:ascii="Arial" w:cs="Arial" w:eastAsia="Arial" w:hAnsi="Arial"/>
+          <w:color w:val="2C2C2C"/>
+          <w:sz w:val="17"/>
+          <w:szCs w:val="17"/>
+        </w:rPr>
+        <w:t xml:space="preserve">The same SOAP note above documented a fuller upper-body carry/press circuit than the eccentric push-up alone captured — explicitly framed by the PT as direct running-economy transfer given Nancy's running-knee-health goal (see Block B's intro below). Folded in this update: (1) arm bike warm-up (1 min forward + 1 min backward) and a mobility-stick shoulder circuit, added to Day 2's warm-up; (2) Standing Resistance Band Chest Press, a core-anti-rotation pressing accessory, added to Day 2 Block A; (3) DB Deadlift → Farmer Carry Combo, Static Overhead DB Hold (Walking), and Landmine Shoulder Press added to Day 2 Block B — the press is deliberately sequenced between the two carry-pattern additions to avoid stacking 3 consecutive loaded-carry exercises (Farmer Carry / DB Deadlift+Carry Combo / Static OH Hold Walking are all carry-pattern), per the Antagonist Rotation Rule.</w:t>
+      </w:r>
+    </w:p>
+    <w:p>
+      <w:pPr>
         <w:spacing w:after="80"/>
       </w:pPr>
     </w:p>
@@ -5162,7 +5187,7 @@
           <w:sz w:val="17"/>
           <w:szCs w:val="17"/>
         </w:rPr>
-        <w:t xml:space="preserve">Band pull-aparts, thoracic rotations, 3×10 scapular push-ups</w:t>
+        <w:t xml:space="preserve">Arm bike 1 min forward + 1 min backward (upper-body cardio + shoulder circulation — the backward direction deliberately engages the posterior shoulder differently, per the 8/12 PT session). Mobility stick shoulder circuit: overhead pass-throughs 2x8-10, external rotation with stick 2x8-10, reach + drive 2x8-10. Then: band pull-aparts, thoracic rotations, 3×10 scapular push-ups.</w:t>
       </w:r>
     </w:p>
     <w:p>
@@ -5203,7 +5228,7 @@
           <w:sz w:val="17"/>
           <w:szCs w:val="17"/>
         </w:rPr>
-        <w:t xml:space="preserve">Incline DB Press Week 1 load is informed by the 8/13 baseline test ("DB Chest Press," 15 lbs). Single-Arm Row loads directly off its own matching baseline (30 lbs x10, Epley 1RM ≈40 lbs).</w:t>
+        <w:t xml:space="preserve">Incline DB Press Week 1 load is informed by the 8/13 baseline test ("DB Chest Press," 15 lbs). Single-Arm Row loads directly off its own matching baseline (30 lbs x10, Epley 1RM ≈40 lbs). Standing Resistance Band Chest Press is added this update — a core-anti-rotation pressing accessory (no bench support) from the 8/12 PT session.</w:t>
       </w:r>
     </w:p>
     <w:tbl>
@@ -6174,6 +6199,235 @@
           </w:p>
         </w:tc>
       </w:tr>
+      <w:tr>
+        <w:tc>
+          <w:tcPr>
+            <w:tcW w:type="dxa" w:w="2400"/>
+            <w:tcBorders>
+              <w:top w:val="none" w:color="FFFFFF" w:sz="0"/>
+              <w:left w:val="none" w:color="FFFFFF" w:sz="0"/>
+              <w:bottom w:val="none" w:color="FFFFFF" w:sz="0"/>
+              <w:right w:val="none" w:color="FFFFFF" w:sz="0"/>
+            </w:tcBorders>
+            <w:shd w:fill="FFFFFF" w:color="auto" w:val="clear"/>
+            <w:tcMar>
+              <w:top w:type="dxa" w:w="40"/>
+              <w:left w:type="dxa" w:w="80"/>
+              <w:bottom w:type="dxa" w:w="40"/>
+              <w:right w:type="dxa" w:w="80"/>
+            </w:tcMar>
+            <w:vAlign w:val="center"/>
+          </w:tcPr>
+          <w:p>
+            <w:r>
+              <w:rPr>
+                <w:rFonts w:ascii="Arial" w:cs="Arial" w:eastAsia="Arial" w:hAnsi="Arial"/>
+                <w:b/>
+                <w:bCs/>
+                <w:color w:val="2C2C2C"/>
+                <w:sz w:val="18"/>
+                <w:szCs w:val="18"/>
+              </w:rPr>
+              <w:t xml:space="preserve">Standing Resistance Band Chest Press</w:t>
+            </w:r>
+          </w:p>
+        </w:tc>
+        <w:tc>
+          <w:tcPr>
+            <w:tcW w:type="dxa" w:w="380"/>
+            <w:tcBorders>
+              <w:top w:val="none" w:color="FFFFFF" w:sz="0"/>
+              <w:left w:val="none" w:color="FFFFFF" w:sz="0"/>
+              <w:bottom w:val="none" w:color="FFFFFF" w:sz="0"/>
+              <w:right w:val="none" w:color="FFFFFF" w:sz="0"/>
+            </w:tcBorders>
+            <w:shd w:fill="FFFFFF" w:color="auto" w:val="clear"/>
+            <w:tcMar>
+              <w:top w:type="dxa" w:w="40"/>
+              <w:left w:type="dxa" w:w="80"/>
+              <w:bottom w:type="dxa" w:w="40"/>
+              <w:right w:type="dxa" w:w="80"/>
+            </w:tcMar>
+            <w:vAlign w:val="center"/>
+          </w:tcPr>
+          <w:p>
+            <w:pPr>
+              <w:jc w:val="center"/>
+            </w:pPr>
+            <w:r>
+              <w:rPr>
+                <w:rFonts w:ascii="Arial" w:cs="Arial" w:eastAsia="Arial" w:hAnsi="Arial"/>
+                <w:color w:val="6B6B6B"/>
+                <w:sz w:val="15"/>
+                <w:szCs w:val="15"/>
+              </w:rPr>
+              <w:t xml:space="preserve">3</w:t>
+            </w:r>
+          </w:p>
+        </w:tc>
+        <w:tc>
+          <w:tcPr>
+            <w:tcW w:type="dxa" w:w="420"/>
+            <w:tcBorders>
+              <w:top w:val="none" w:color="FFFFFF" w:sz="0"/>
+              <w:left w:val="none" w:color="FFFFFF" w:sz="0"/>
+              <w:bottom w:val="none" w:color="FFFFFF" w:sz="0"/>
+              <w:right w:val="none" w:color="FFFFFF" w:sz="0"/>
+            </w:tcBorders>
+            <w:shd w:fill="FFFFFF" w:color="auto" w:val="clear"/>
+            <w:tcMar>
+              <w:top w:type="dxa" w:w="40"/>
+              <w:left w:type="dxa" w:w="80"/>
+              <w:bottom w:type="dxa" w:w="40"/>
+              <w:right w:type="dxa" w:w="80"/>
+            </w:tcMar>
+            <w:vAlign w:val="center"/>
+          </w:tcPr>
+          <w:p>
+            <w:pPr>
+              <w:jc w:val="center"/>
+            </w:pPr>
+            <w:r>
+              <w:rPr>
+                <w:rFonts w:ascii="Arial" w:cs="Arial" w:eastAsia="Arial" w:hAnsi="Arial"/>
+                <w:color w:val="6B6B6B"/>
+                <w:sz w:val="15"/>
+                <w:szCs w:val="15"/>
+              </w:rPr>
+              <w:t xml:space="preserve">10-12</w:t>
+            </w:r>
+          </w:p>
+        </w:tc>
+        <w:tc>
+          <w:tcPr>
+            <w:tcW w:type="dxa" w:w="680"/>
+            <w:tcBorders>
+              <w:top w:val="none" w:color="FFFFFF" w:sz="0"/>
+              <w:left w:val="none" w:color="FFFFFF" w:sz="0"/>
+              <w:bottom w:val="none" w:color="FFFFFF" w:sz="0"/>
+              <w:right w:val="none" w:color="FFFFFF" w:sz="0"/>
+            </w:tcBorders>
+            <w:shd w:fill="FFFFFF" w:color="auto" w:val="clear"/>
+            <w:tcMar>
+              <w:top w:type="dxa" w:w="40"/>
+              <w:left w:type="dxa" w:w="80"/>
+              <w:bottom w:type="dxa" w:w="40"/>
+              <w:right w:type="dxa" w:w="80"/>
+            </w:tcMar>
+            <w:vAlign w:val="center"/>
+          </w:tcPr>
+          <w:p>
+            <w:pPr>
+              <w:jc w:val="center"/>
+            </w:pPr>
+            <w:r>
+              <w:rPr>
+                <w:rFonts w:ascii="Arial" w:cs="Arial" w:eastAsia="Arial" w:hAnsi="Arial"/>
+                <w:color w:val="6B6B6B"/>
+                <w:sz w:val="15"/>
+                <w:szCs w:val="15"/>
+              </w:rPr>
+              <w:t xml:space="preserve">light-mod band</w:t>
+            </w:r>
+          </w:p>
+        </w:tc>
+        <w:tc>
+          <w:tcPr>
+            <w:tcW w:type="dxa" w:w="540"/>
+            <w:tcBorders>
+              <w:top w:val="none" w:color="FFFFFF" w:sz="0"/>
+              <w:left w:val="none" w:color="FFFFFF" w:sz="0"/>
+              <w:bottom w:val="none" w:color="FFFFFF" w:sz="0"/>
+              <w:right w:val="none" w:color="FFFFFF" w:sz="0"/>
+            </w:tcBorders>
+            <w:shd w:fill="FFFFFF" w:color="auto" w:val="clear"/>
+            <w:tcMar>
+              <w:top w:type="dxa" w:w="40"/>
+              <w:left w:type="dxa" w:w="80"/>
+              <w:bottom w:type="dxa" w:w="40"/>
+              <w:right w:type="dxa" w:w="80"/>
+            </w:tcMar>
+            <w:vAlign w:val="center"/>
+          </w:tcPr>
+          <w:p>
+            <w:pPr>
+              <w:jc w:val="center"/>
+            </w:pPr>
+            <w:r>
+              <w:rPr>
+                <w:rFonts w:ascii="Arial" w:cs="Arial" w:eastAsia="Arial" w:hAnsi="Arial"/>
+                <w:color w:val="6B6B6B"/>
+                <w:sz w:val="15"/>
+                <w:szCs w:val="15"/>
+              </w:rPr>
+              <w:t xml:space="preserve">2-1-2</w:t>
+            </w:r>
+          </w:p>
+        </w:tc>
+        <w:tc>
+          <w:tcPr>
+            <w:tcW w:type="dxa" w:w="440"/>
+            <w:tcBorders>
+              <w:top w:val="none" w:color="FFFFFF" w:sz="0"/>
+              <w:left w:val="none" w:color="FFFFFF" w:sz="0"/>
+              <w:bottom w:val="none" w:color="FFFFFF" w:sz="0"/>
+              <w:right w:val="none" w:color="FFFFFF" w:sz="0"/>
+            </w:tcBorders>
+            <w:shd w:fill="FFFFFF" w:color="auto" w:val="clear"/>
+            <w:tcMar>
+              <w:top w:type="dxa" w:w="40"/>
+              <w:left w:type="dxa" w:w="80"/>
+              <w:bottom w:type="dxa" w:w="40"/>
+              <w:right w:type="dxa" w:w="80"/>
+            </w:tcMar>
+            <w:vAlign w:val="center"/>
+          </w:tcPr>
+          <w:p>
+            <w:pPr>
+              <w:jc w:val="center"/>
+            </w:pPr>
+            <w:r>
+              <w:rPr>
+                <w:rFonts w:ascii="Arial" w:cs="Arial" w:eastAsia="Arial" w:hAnsi="Arial"/>
+                <w:color w:val="6B6B6B"/>
+                <w:sz w:val="15"/>
+                <w:szCs w:val="15"/>
+              </w:rPr>
+              <w:t xml:space="preserve">45s</w:t>
+            </w:r>
+          </w:p>
+        </w:tc>
+        <w:tc>
+          <w:tcPr>
+            <w:tcW w:type="dxa" w:w="5580"/>
+            <w:tcBorders>
+              <w:top w:val="none" w:color="FFFFFF" w:sz="0"/>
+              <w:left w:val="none" w:color="FFFFFF" w:sz="0"/>
+              <w:bottom w:val="none" w:color="FFFFFF" w:sz="0"/>
+              <w:right w:val="none" w:color="FFFFFF" w:sz="0"/>
+            </w:tcBorders>
+            <w:shd w:fill="FFFFFF" w:color="auto" w:val="clear"/>
+            <w:tcMar>
+              <w:top w:type="dxa" w:w="40"/>
+              <w:left w:type="dxa" w:w="80"/>
+              <w:bottom w:type="dxa" w:w="40"/>
+              <w:right w:type="dxa" w:w="80"/>
+            </w:tcMar>
+            <w:vAlign w:val="center"/>
+          </w:tcPr>
+          <w:p>
+            <w:r>
+              <w:rPr>
+                <w:rFonts w:ascii="Arial" w:cs="Arial" w:eastAsia="Arial" w:hAnsi="Arial"/>
+                <w:color w:val="6B6B6B"/>
+                <w:sz w:val="17"/>
+                <w:szCs w:val="17"/>
+              </w:rPr>
+              <w:t xml:space="preserve">New this update. No bench support — standing, anti-rotation core demand throughout the press. Press straight ahead, resist trunk rotation, control the return.</w:t>
+            </w:r>
+          </w:p>
+        </w:tc>
+      </w:tr>
     </w:tbl>
     <w:p>
       <w:pPr>
@@ -6194,6 +6448,31 @@
           <w:szCs w:val="17"/>
         </w:rPr>
         <w:t xml:space="preserve">B — Accessory</w:t>
+      </w:r>
+    </w:p>
+    <w:p>
+      <w:pPr>
+        <w:spacing w:after="80"/>
+      </w:pPr>
+      <w:r>
+        <w:rPr>
+          <w:rFonts w:ascii="Arial" w:cs="Arial" w:eastAsia="Arial" w:hAnsi="Arial"/>
+          <w:b/>
+          <w:bCs/>
+          <w:color w:val="C9A227"/>
+          <w:sz w:val="17"/>
+          <w:szCs w:val="17"/>
+        </w:rPr>
+        <w:t xml:space="preserve">Why:  </w:t>
+      </w:r>
+      <w:r>
+        <w:rPr>
+          <w:rFonts w:ascii="Arial" w:cs="Arial" w:eastAsia="Arial" w:hAnsi="Arial"/>
+          <w:color w:val="2C2C2C"/>
+          <w:sz w:val="17"/>
+          <w:szCs w:val="17"/>
+        </w:rPr>
+        <w:t xml:space="preserve">Face Pulls lead for rear-delt/rotator health. DB Deadlift → Farmer Carry Combo and Static Overhead DB Hold (Walking) are added this update — both explicitly framed by the PT as direct running-economy transfer, given Nancy's documented running-knee-health goal: grip, gait, and anti-lateral-flexion core demand under load carry over directly to running mechanics. Landmine Shoulder Press is sequenced between the two carry-pattern additions to avoid stacking 3 consecutive loaded-carry exercises in a row (Antagonist Rotation Rule).</w:t>
       </w:r>
     </w:p>
     <w:tbl>
@@ -6918,6 +7197,706 @@
                 <w:szCs w:val="17"/>
               </w:rPr>
               <w:t xml:space="preserve">Tall posture; tight core</w:t>
+            </w:r>
+          </w:p>
+        </w:tc>
+      </w:tr>
+      <w:tr>
+        <w:tc>
+          <w:tcPr>
+            <w:tcW w:type="dxa" w:w="2400"/>
+            <w:tcBorders>
+              <w:top w:val="none" w:color="FFFFFF" w:sz="0"/>
+              <w:left w:val="none" w:color="FFFFFF" w:sz="0"/>
+              <w:bottom w:val="none" w:color="FFFFFF" w:sz="0"/>
+              <w:right w:val="none" w:color="FFFFFF" w:sz="0"/>
+            </w:tcBorders>
+            <w:shd w:fill="FAF3E0" w:color="auto" w:val="clear"/>
+            <w:tcMar>
+              <w:top w:type="dxa" w:w="40"/>
+              <w:left w:type="dxa" w:w="80"/>
+              <w:bottom w:type="dxa" w:w="40"/>
+              <w:right w:type="dxa" w:w="80"/>
+            </w:tcMar>
+            <w:vAlign w:val="center"/>
+          </w:tcPr>
+          <w:p>
+            <w:r>
+              <w:rPr>
+                <w:rFonts w:ascii="Arial" w:cs="Arial" w:eastAsia="Arial" w:hAnsi="Arial"/>
+                <w:b/>
+                <w:bCs/>
+                <w:color w:val="2C2C2C"/>
+                <w:sz w:val="18"/>
+                <w:szCs w:val="18"/>
+              </w:rPr>
+              <w:t xml:space="preserve">Landmine Shoulder Press</w:t>
+            </w:r>
+          </w:p>
+        </w:tc>
+        <w:tc>
+          <w:tcPr>
+            <w:tcW w:type="dxa" w:w="380"/>
+            <w:tcBorders>
+              <w:top w:val="none" w:color="FFFFFF" w:sz="0"/>
+              <w:left w:val="none" w:color="FFFFFF" w:sz="0"/>
+              <w:bottom w:val="none" w:color="FFFFFF" w:sz="0"/>
+              <w:right w:val="none" w:color="FFFFFF" w:sz="0"/>
+            </w:tcBorders>
+            <w:shd w:fill="FAF3E0" w:color="auto" w:val="clear"/>
+            <w:tcMar>
+              <w:top w:type="dxa" w:w="40"/>
+              <w:left w:type="dxa" w:w="80"/>
+              <w:bottom w:type="dxa" w:w="40"/>
+              <w:right w:type="dxa" w:w="80"/>
+            </w:tcMar>
+            <w:vAlign w:val="center"/>
+          </w:tcPr>
+          <w:p>
+            <w:pPr>
+              <w:jc w:val="center"/>
+            </w:pPr>
+            <w:r>
+              <w:rPr>
+                <w:rFonts w:ascii="Arial" w:cs="Arial" w:eastAsia="Arial" w:hAnsi="Arial"/>
+                <w:color w:val="6B6B6B"/>
+                <w:sz w:val="15"/>
+                <w:szCs w:val="15"/>
+              </w:rPr>
+              <w:t xml:space="preserve">3</w:t>
+            </w:r>
+          </w:p>
+        </w:tc>
+        <w:tc>
+          <w:tcPr>
+            <w:tcW w:type="dxa" w:w="420"/>
+            <w:tcBorders>
+              <w:top w:val="none" w:color="FFFFFF" w:sz="0"/>
+              <w:left w:val="none" w:color="FFFFFF" w:sz="0"/>
+              <w:bottom w:val="none" w:color="FFFFFF" w:sz="0"/>
+              <w:right w:val="none" w:color="FFFFFF" w:sz="0"/>
+            </w:tcBorders>
+            <w:shd w:fill="FAF3E0" w:color="auto" w:val="clear"/>
+            <w:tcMar>
+              <w:top w:type="dxa" w:w="40"/>
+              <w:left w:type="dxa" w:w="80"/>
+              <w:bottom w:type="dxa" w:w="40"/>
+              <w:right w:type="dxa" w:w="80"/>
+            </w:tcMar>
+            <w:vAlign w:val="center"/>
+          </w:tcPr>
+          <w:p>
+            <w:pPr>
+              <w:jc w:val="center"/>
+            </w:pPr>
+            <w:r>
+              <w:rPr>
+                <w:rFonts w:ascii="Arial" w:cs="Arial" w:eastAsia="Arial" w:hAnsi="Arial"/>
+                <w:color w:val="6B6B6B"/>
+                <w:sz w:val="15"/>
+                <w:szCs w:val="15"/>
+              </w:rPr>
+              <w:t xml:space="preserve">8-10/side</w:t>
+            </w:r>
+          </w:p>
+        </w:tc>
+        <w:tc>
+          <w:tcPr>
+            <w:tcW w:type="dxa" w:w="680"/>
+            <w:tcBorders>
+              <w:top w:val="none" w:color="FFFFFF" w:sz="0"/>
+              <w:left w:val="none" w:color="FFFFFF" w:sz="0"/>
+              <w:bottom w:val="none" w:color="FFFFFF" w:sz="0"/>
+              <w:right w:val="none" w:color="FFFFFF" w:sz="0"/>
+            </w:tcBorders>
+            <w:shd w:fill="FAF3E0" w:color="auto" w:val="clear"/>
+            <w:tcMar>
+              <w:top w:type="dxa" w:w="40"/>
+              <w:left w:type="dxa" w:w="80"/>
+              <w:bottom w:type="dxa" w:w="40"/>
+              <w:right w:type="dxa" w:w="80"/>
+            </w:tcMar>
+            <w:vAlign w:val="center"/>
+          </w:tcPr>
+          <w:p>
+            <w:pPr>
+              <w:jc w:val="center"/>
+            </w:pPr>
+            <w:r>
+              <w:rPr>
+                <w:rFonts w:ascii="Arial" w:cs="Arial" w:eastAsia="Arial" w:hAnsi="Arial"/>
+                <w:color w:val="6B6B6B"/>
+                <w:sz w:val="15"/>
+                <w:szCs w:val="15"/>
+              </w:rPr>
+              <w:t xml:space="preserve">light-mod — coach discretion</w:t>
+            </w:r>
+          </w:p>
+        </w:tc>
+        <w:tc>
+          <w:tcPr>
+            <w:tcW w:type="dxa" w:w="540"/>
+            <w:tcBorders>
+              <w:top w:val="none" w:color="FFFFFF" w:sz="0"/>
+              <w:left w:val="none" w:color="FFFFFF" w:sz="0"/>
+              <w:bottom w:val="none" w:color="FFFFFF" w:sz="0"/>
+              <w:right w:val="none" w:color="FFFFFF" w:sz="0"/>
+            </w:tcBorders>
+            <w:shd w:fill="FAF3E0" w:color="auto" w:val="clear"/>
+            <w:tcMar>
+              <w:top w:type="dxa" w:w="40"/>
+              <w:left w:type="dxa" w:w="80"/>
+              <w:bottom w:type="dxa" w:w="40"/>
+              <w:right w:type="dxa" w:w="80"/>
+            </w:tcMar>
+            <w:vAlign w:val="center"/>
+          </w:tcPr>
+          <w:p>
+            <w:pPr>
+              <w:jc w:val="center"/>
+            </w:pPr>
+            <w:r>
+              <w:rPr>
+                <w:rFonts w:ascii="Arial" w:cs="Arial" w:eastAsia="Arial" w:hAnsi="Arial"/>
+                <w:color w:val="6B6B6B"/>
+                <w:sz w:val="15"/>
+                <w:szCs w:val="15"/>
+              </w:rPr>
+              <w:t xml:space="preserve">2-1-2</w:t>
+            </w:r>
+          </w:p>
+        </w:tc>
+        <w:tc>
+          <w:tcPr>
+            <w:tcW w:type="dxa" w:w="440"/>
+            <w:tcBorders>
+              <w:top w:val="none" w:color="FFFFFF" w:sz="0"/>
+              <w:left w:val="none" w:color="FFFFFF" w:sz="0"/>
+              <w:bottom w:val="none" w:color="FFFFFF" w:sz="0"/>
+              <w:right w:val="none" w:color="FFFFFF" w:sz="0"/>
+            </w:tcBorders>
+            <w:shd w:fill="FAF3E0" w:color="auto" w:val="clear"/>
+            <w:tcMar>
+              <w:top w:type="dxa" w:w="40"/>
+              <w:left w:type="dxa" w:w="80"/>
+              <w:bottom w:type="dxa" w:w="40"/>
+              <w:right w:type="dxa" w:w="80"/>
+            </w:tcMar>
+            <w:vAlign w:val="center"/>
+          </w:tcPr>
+          <w:p>
+            <w:pPr>
+              <w:jc w:val="center"/>
+            </w:pPr>
+            <w:r>
+              <w:rPr>
+                <w:rFonts w:ascii="Arial" w:cs="Arial" w:eastAsia="Arial" w:hAnsi="Arial"/>
+                <w:color w:val="6B6B6B"/>
+                <w:sz w:val="15"/>
+                <w:szCs w:val="15"/>
+              </w:rPr>
+              <w:t xml:space="preserve">60s</w:t>
+            </w:r>
+          </w:p>
+        </w:tc>
+        <w:tc>
+          <w:tcPr>
+            <w:tcW w:type="dxa" w:w="5580"/>
+            <w:tcBorders>
+              <w:top w:val="none" w:color="FFFFFF" w:sz="0"/>
+              <w:left w:val="none" w:color="FFFFFF" w:sz="0"/>
+              <w:bottom w:val="none" w:color="FFFFFF" w:sz="0"/>
+              <w:right w:val="none" w:color="FFFFFF" w:sz="0"/>
+            </w:tcBorders>
+            <w:shd w:fill="FAF3E0" w:color="auto" w:val="clear"/>
+            <w:tcMar>
+              <w:top w:type="dxa" w:w="40"/>
+              <w:left w:type="dxa" w:w="80"/>
+              <w:bottom w:type="dxa" w:w="40"/>
+              <w:right w:type="dxa" w:w="80"/>
+            </w:tcMar>
+            <w:vAlign w:val="center"/>
+          </w:tcPr>
+          <w:p>
+            <w:r>
+              <w:rPr>
+                <w:rFonts w:ascii="Arial" w:cs="Arial" w:eastAsia="Arial" w:hAnsi="Arial"/>
+                <w:color w:val="6B6B6B"/>
+                <w:sz w:val="17"/>
+                <w:szCs w:val="17"/>
+              </w:rPr>
+              <w:t xml:space="preserve">New this update. Scap-friendly unilateral press — landmine angle reduces shoulder impingement risk vs. a straight vertical press.</w:t>
+            </w:r>
+          </w:p>
+        </w:tc>
+      </w:tr>
+      <w:tr>
+        <w:tc>
+          <w:tcPr>
+            <w:tcW w:type="dxa" w:w="2400"/>
+            <w:tcBorders>
+              <w:top w:val="none" w:color="FFFFFF" w:sz="0"/>
+              <w:left w:val="none" w:color="FFFFFF" w:sz="0"/>
+              <w:bottom w:val="none" w:color="FFFFFF" w:sz="0"/>
+              <w:right w:val="none" w:color="FFFFFF" w:sz="0"/>
+            </w:tcBorders>
+            <w:shd w:fill="FFFFFF" w:color="auto" w:val="clear"/>
+            <w:tcMar>
+              <w:top w:type="dxa" w:w="40"/>
+              <w:left w:type="dxa" w:w="80"/>
+              <w:bottom w:type="dxa" w:w="40"/>
+              <w:right w:type="dxa" w:w="80"/>
+            </w:tcMar>
+            <w:vAlign w:val="center"/>
+          </w:tcPr>
+          <w:p>
+            <w:r>
+              <w:rPr>
+                <w:rFonts w:ascii="Arial" w:cs="Arial" w:eastAsia="Arial" w:hAnsi="Arial"/>
+                <w:b/>
+                <w:bCs/>
+                <w:color w:val="2C2C2C"/>
+                <w:sz w:val="18"/>
+                <w:szCs w:val="18"/>
+              </w:rPr>
+              <w:t xml:space="preserve">DB Deadlift → Farmer Carry Combo</w:t>
+            </w:r>
+          </w:p>
+          <w:p>
+            <w:r>
+              <w:rPr>
+                <w:rFonts w:ascii="Arial" w:cs="Arial" w:eastAsia="Arial" w:hAnsi="Arial"/>
+                <w:i/>
+                <w:iCs/>
+                <w:color w:val="6B6B6B"/>
+                <w:sz w:val="14"/>
+                <w:szCs w:val="14"/>
+              </w:rPr>
+              <w:t xml:space="preserve">Running-economy transfer, per the 8/12 PT session — hinge + loaded-carry combination targets the same grip/gait/core-stability qualities that support running mechanics.</w:t>
+            </w:r>
+          </w:p>
+        </w:tc>
+        <w:tc>
+          <w:tcPr>
+            <w:tcW w:type="dxa" w:w="380"/>
+            <w:tcBorders>
+              <w:top w:val="none" w:color="FFFFFF" w:sz="0"/>
+              <w:left w:val="none" w:color="FFFFFF" w:sz="0"/>
+              <w:bottom w:val="none" w:color="FFFFFF" w:sz="0"/>
+              <w:right w:val="none" w:color="FFFFFF" w:sz="0"/>
+            </w:tcBorders>
+            <w:shd w:fill="FFFFFF" w:color="auto" w:val="clear"/>
+            <w:tcMar>
+              <w:top w:type="dxa" w:w="40"/>
+              <w:left w:type="dxa" w:w="80"/>
+              <w:bottom w:type="dxa" w:w="40"/>
+              <w:right w:type="dxa" w:w="80"/>
+            </w:tcMar>
+            <w:vAlign w:val="center"/>
+          </w:tcPr>
+          <w:p>
+            <w:pPr>
+              <w:jc w:val="center"/>
+            </w:pPr>
+            <w:r>
+              <w:rPr>
+                <w:rFonts w:ascii="Arial" w:cs="Arial" w:eastAsia="Arial" w:hAnsi="Arial"/>
+                <w:color w:val="6B6B6B"/>
+                <w:sz w:val="15"/>
+                <w:szCs w:val="15"/>
+              </w:rPr>
+              <w:t xml:space="preserve">3</w:t>
+            </w:r>
+          </w:p>
+        </w:tc>
+        <w:tc>
+          <w:tcPr>
+            <w:tcW w:type="dxa" w:w="420"/>
+            <w:tcBorders>
+              <w:top w:val="none" w:color="FFFFFF" w:sz="0"/>
+              <w:left w:val="none" w:color="FFFFFF" w:sz="0"/>
+              <w:bottom w:val="none" w:color="FFFFFF" w:sz="0"/>
+              <w:right w:val="none" w:color="FFFFFF" w:sz="0"/>
+            </w:tcBorders>
+            <w:shd w:fill="FFFFFF" w:color="auto" w:val="clear"/>
+            <w:tcMar>
+              <w:top w:type="dxa" w:w="40"/>
+              <w:left w:type="dxa" w:w="80"/>
+              <w:bottom w:type="dxa" w:w="40"/>
+              <w:right w:type="dxa" w:w="80"/>
+            </w:tcMar>
+            <w:vAlign w:val="center"/>
+          </w:tcPr>
+          <w:p>
+            <w:pPr>
+              <w:jc w:val="center"/>
+            </w:pPr>
+            <w:r>
+              <w:rPr>
+                <w:rFonts w:ascii="Arial" w:cs="Arial" w:eastAsia="Arial" w:hAnsi="Arial"/>
+                <w:color w:val="6B6B6B"/>
+                <w:sz w:val="15"/>
+                <w:szCs w:val="15"/>
+              </w:rPr>
+              <w:t xml:space="preserve">6-8 DL into 20-30 yd carry</w:t>
+            </w:r>
+          </w:p>
+        </w:tc>
+        <w:tc>
+          <w:tcPr>
+            <w:tcW w:type="dxa" w:w="680"/>
+            <w:tcBorders>
+              <w:top w:val="none" w:color="FFFFFF" w:sz="0"/>
+              <w:left w:val="none" w:color="FFFFFF" w:sz="0"/>
+              <w:bottom w:val="none" w:color="FFFFFF" w:sz="0"/>
+              <w:right w:val="none" w:color="FFFFFF" w:sz="0"/>
+            </w:tcBorders>
+            <w:shd w:fill="FFFFFF" w:color="auto" w:val="clear"/>
+            <w:tcMar>
+              <w:top w:type="dxa" w:w="40"/>
+              <w:left w:type="dxa" w:w="80"/>
+              <w:bottom w:type="dxa" w:w="40"/>
+              <w:right w:type="dxa" w:w="80"/>
+            </w:tcMar>
+            <w:vAlign w:val="center"/>
+          </w:tcPr>
+          <w:p>
+            <w:pPr>
+              <w:jc w:val="center"/>
+            </w:pPr>
+            <w:r>
+              <w:rPr>
+                <w:rFonts w:ascii="Arial" w:cs="Arial" w:eastAsia="Arial" w:hAnsi="Arial"/>
+                <w:color w:val="6B6B6B"/>
+                <w:sz w:val="15"/>
+                <w:szCs w:val="15"/>
+              </w:rPr>
+              <w:t xml:space="preserve">moderate — coach discretion</w:t>
+            </w:r>
+          </w:p>
+        </w:tc>
+        <w:tc>
+          <w:tcPr>
+            <w:tcW w:type="dxa" w:w="540"/>
+            <w:tcBorders>
+              <w:top w:val="none" w:color="FFFFFF" w:sz="0"/>
+              <w:left w:val="none" w:color="FFFFFF" w:sz="0"/>
+              <w:bottom w:val="none" w:color="FFFFFF" w:sz="0"/>
+              <w:right w:val="none" w:color="FFFFFF" w:sz="0"/>
+            </w:tcBorders>
+            <w:shd w:fill="FFFFFF" w:color="auto" w:val="clear"/>
+            <w:tcMar>
+              <w:top w:type="dxa" w:w="40"/>
+              <w:left w:type="dxa" w:w="80"/>
+              <w:bottom w:type="dxa" w:w="40"/>
+              <w:right w:type="dxa" w:w="80"/>
+            </w:tcMar>
+            <w:vAlign w:val="center"/>
+          </w:tcPr>
+          <w:p>
+            <w:pPr>
+              <w:jc w:val="center"/>
+            </w:pPr>
+            <w:r>
+              <w:rPr>
+                <w:rFonts w:ascii="Arial" w:cs="Arial" w:eastAsia="Arial" w:hAnsi="Arial"/>
+                <w:color w:val="6B6B6B"/>
+                <w:sz w:val="15"/>
+                <w:szCs w:val="15"/>
+              </w:rPr>
+              <w:t xml:space="preserve">controlled</w:t>
+            </w:r>
+          </w:p>
+        </w:tc>
+        <w:tc>
+          <w:tcPr>
+            <w:tcW w:type="dxa" w:w="440"/>
+            <w:tcBorders>
+              <w:top w:val="none" w:color="FFFFFF" w:sz="0"/>
+              <w:left w:val="none" w:color="FFFFFF" w:sz="0"/>
+              <w:bottom w:val="none" w:color="FFFFFF" w:sz="0"/>
+              <w:right w:val="none" w:color="FFFFFF" w:sz="0"/>
+            </w:tcBorders>
+            <w:shd w:fill="FFFFFF" w:color="auto" w:val="clear"/>
+            <w:tcMar>
+              <w:top w:type="dxa" w:w="40"/>
+              <w:left w:type="dxa" w:w="80"/>
+              <w:bottom w:type="dxa" w:w="40"/>
+              <w:right w:type="dxa" w:w="80"/>
+            </w:tcMar>
+            <w:vAlign w:val="center"/>
+          </w:tcPr>
+          <w:p>
+            <w:pPr>
+              <w:jc w:val="center"/>
+            </w:pPr>
+            <w:r>
+              <w:rPr>
+                <w:rFonts w:ascii="Arial" w:cs="Arial" w:eastAsia="Arial" w:hAnsi="Arial"/>
+                <w:color w:val="6B6B6B"/>
+                <w:sz w:val="15"/>
+                <w:szCs w:val="15"/>
+              </w:rPr>
+              <w:t xml:space="preserve">75s</w:t>
+            </w:r>
+          </w:p>
+        </w:tc>
+        <w:tc>
+          <w:tcPr>
+            <w:tcW w:type="dxa" w:w="5580"/>
+            <w:tcBorders>
+              <w:top w:val="none" w:color="FFFFFF" w:sz="0"/>
+              <w:left w:val="none" w:color="FFFFFF" w:sz="0"/>
+              <w:bottom w:val="none" w:color="FFFFFF" w:sz="0"/>
+              <w:right w:val="none" w:color="FFFFFF" w:sz="0"/>
+            </w:tcBorders>
+            <w:shd w:fill="FFFFFF" w:color="auto" w:val="clear"/>
+            <w:tcMar>
+              <w:top w:type="dxa" w:w="40"/>
+              <w:left w:type="dxa" w:w="80"/>
+              <w:bottom w:type="dxa" w:w="40"/>
+              <w:right w:type="dxa" w:w="80"/>
+            </w:tcMar>
+            <w:vAlign w:val="center"/>
+          </w:tcPr>
+          <w:p>
+            <w:r>
+              <w:rPr>
+                <w:rFonts w:ascii="Arial" w:cs="Arial" w:eastAsia="Arial" w:hAnsi="Arial"/>
+                <w:color w:val="6B6B6B"/>
+                <w:sz w:val="17"/>
+                <w:szCs w:val="17"/>
+              </w:rPr>
+              <w:t xml:space="preserve">New this update. Hinge into an immediate loaded carry — grip, gait, and anti-lateral-flexion core demand in one continuous drill. PT-framed as direct running-economy transfer.</w:t>
+            </w:r>
+          </w:p>
+        </w:tc>
+      </w:tr>
+      <w:tr>
+        <w:tc>
+          <w:tcPr>
+            <w:tcW w:type="dxa" w:w="2400"/>
+            <w:tcBorders>
+              <w:top w:val="none" w:color="FFFFFF" w:sz="0"/>
+              <w:left w:val="none" w:color="FFFFFF" w:sz="0"/>
+              <w:bottom w:val="none" w:color="FFFFFF" w:sz="0"/>
+              <w:right w:val="none" w:color="FFFFFF" w:sz="0"/>
+            </w:tcBorders>
+            <w:shd w:fill="FAF3E0" w:color="auto" w:val="clear"/>
+            <w:tcMar>
+              <w:top w:type="dxa" w:w="40"/>
+              <w:left w:type="dxa" w:w="80"/>
+              <w:bottom w:type="dxa" w:w="40"/>
+              <w:right w:type="dxa" w:w="80"/>
+            </w:tcMar>
+            <w:vAlign w:val="center"/>
+          </w:tcPr>
+          <w:p>
+            <w:r>
+              <w:rPr>
+                <w:rFonts w:ascii="Arial" w:cs="Arial" w:eastAsia="Arial" w:hAnsi="Arial"/>
+                <w:b/>
+                <w:bCs/>
+                <w:color w:val="2C2C2C"/>
+                <w:sz w:val="18"/>
+                <w:szCs w:val="18"/>
+              </w:rPr>
+              <w:t xml:space="preserve">Static Overhead DB Hold (Walking)</w:t>
+            </w:r>
+          </w:p>
+        </w:tc>
+        <w:tc>
+          <w:tcPr>
+            <w:tcW w:type="dxa" w:w="380"/>
+            <w:tcBorders>
+              <w:top w:val="none" w:color="FFFFFF" w:sz="0"/>
+              <w:left w:val="none" w:color="FFFFFF" w:sz="0"/>
+              <w:bottom w:val="none" w:color="FFFFFF" w:sz="0"/>
+              <w:right w:val="none" w:color="FFFFFF" w:sz="0"/>
+            </w:tcBorders>
+            <w:shd w:fill="FAF3E0" w:color="auto" w:val="clear"/>
+            <w:tcMar>
+              <w:top w:type="dxa" w:w="40"/>
+              <w:left w:type="dxa" w:w="80"/>
+              <w:bottom w:type="dxa" w:w="40"/>
+              <w:right w:type="dxa" w:w="80"/>
+            </w:tcMar>
+            <w:vAlign w:val="center"/>
+          </w:tcPr>
+          <w:p>
+            <w:pPr>
+              <w:jc w:val="center"/>
+            </w:pPr>
+            <w:r>
+              <w:rPr>
+                <w:rFonts w:ascii="Arial" w:cs="Arial" w:eastAsia="Arial" w:hAnsi="Arial"/>
+                <w:color w:val="6B6B6B"/>
+                <w:sz w:val="15"/>
+                <w:szCs w:val="15"/>
+              </w:rPr>
+              <w:t xml:space="preserve">2-3</w:t>
+            </w:r>
+          </w:p>
+        </w:tc>
+        <w:tc>
+          <w:tcPr>
+            <w:tcW w:type="dxa" w:w="420"/>
+            <w:tcBorders>
+              <w:top w:val="none" w:color="FFFFFF" w:sz="0"/>
+              <w:left w:val="none" w:color="FFFFFF" w:sz="0"/>
+              <w:bottom w:val="none" w:color="FFFFFF" w:sz="0"/>
+              <w:right w:val="none" w:color="FFFFFF" w:sz="0"/>
+            </w:tcBorders>
+            <w:shd w:fill="FAF3E0" w:color="auto" w:val="clear"/>
+            <w:tcMar>
+              <w:top w:type="dxa" w:w="40"/>
+              <w:left w:type="dxa" w:w="80"/>
+              <w:bottom w:type="dxa" w:w="40"/>
+              <w:right w:type="dxa" w:w="80"/>
+            </w:tcMar>
+            <w:vAlign w:val="center"/>
+          </w:tcPr>
+          <w:p>
+            <w:pPr>
+              <w:jc w:val="center"/>
+            </w:pPr>
+            <w:r>
+              <w:rPr>
+                <w:rFonts w:ascii="Arial" w:cs="Arial" w:eastAsia="Arial" w:hAnsi="Arial"/>
+                <w:color w:val="6B6B6B"/>
+                <w:sz w:val="15"/>
+                <w:szCs w:val="15"/>
+              </w:rPr>
+              <w:t xml:space="preserve">20-30 yd</w:t>
+            </w:r>
+          </w:p>
+        </w:tc>
+        <w:tc>
+          <w:tcPr>
+            <w:tcW w:type="dxa" w:w="680"/>
+            <w:tcBorders>
+              <w:top w:val="none" w:color="FFFFFF" w:sz="0"/>
+              <w:left w:val="none" w:color="FFFFFF" w:sz="0"/>
+              <w:bottom w:val="none" w:color="FFFFFF" w:sz="0"/>
+              <w:right w:val="none" w:color="FFFFFF" w:sz="0"/>
+            </w:tcBorders>
+            <w:shd w:fill="FAF3E0" w:color="auto" w:val="clear"/>
+            <w:tcMar>
+              <w:top w:type="dxa" w:w="40"/>
+              <w:left w:type="dxa" w:w="80"/>
+              <w:bottom w:type="dxa" w:w="40"/>
+              <w:right w:type="dxa" w:w="80"/>
+            </w:tcMar>
+            <w:vAlign w:val="center"/>
+          </w:tcPr>
+          <w:p>
+            <w:pPr>
+              <w:jc w:val="center"/>
+            </w:pPr>
+            <w:r>
+              <w:rPr>
+                <w:rFonts w:ascii="Arial" w:cs="Arial" w:eastAsia="Arial" w:hAnsi="Arial"/>
+                <w:color w:val="6B6B6B"/>
+                <w:sz w:val="15"/>
+                <w:szCs w:val="15"/>
+              </w:rPr>
+              <w:t xml:space="preserve">light-mod DB — coach discretion</w:t>
+            </w:r>
+          </w:p>
+        </w:tc>
+        <w:tc>
+          <w:tcPr>
+            <w:tcW w:type="dxa" w:w="540"/>
+            <w:tcBorders>
+              <w:top w:val="none" w:color="FFFFFF" w:sz="0"/>
+              <w:left w:val="none" w:color="FFFFFF" w:sz="0"/>
+              <w:bottom w:val="none" w:color="FFFFFF" w:sz="0"/>
+              <w:right w:val="none" w:color="FFFFFF" w:sz="0"/>
+            </w:tcBorders>
+            <w:shd w:fill="FAF3E0" w:color="auto" w:val="clear"/>
+            <w:tcMar>
+              <w:top w:type="dxa" w:w="40"/>
+              <w:left w:type="dxa" w:w="80"/>
+              <w:bottom w:type="dxa" w:w="40"/>
+              <w:right w:type="dxa" w:w="80"/>
+            </w:tcMar>
+            <w:vAlign w:val="center"/>
+          </w:tcPr>
+          <w:p>
+            <w:pPr>
+              <w:jc w:val="center"/>
+            </w:pPr>
+            <w:r>
+              <w:rPr>
+                <w:rFonts w:ascii="Arial" w:cs="Arial" w:eastAsia="Arial" w:hAnsi="Arial"/>
+                <w:color w:val="6B6B6B"/>
+                <w:sz w:val="15"/>
+                <w:szCs w:val="15"/>
+              </w:rPr>
+              <w:t xml:space="preserve">controlled walk</w:t>
+            </w:r>
+          </w:p>
+        </w:tc>
+        <w:tc>
+          <w:tcPr>
+            <w:tcW w:type="dxa" w:w="440"/>
+            <w:tcBorders>
+              <w:top w:val="none" w:color="FFFFFF" w:sz="0"/>
+              <w:left w:val="none" w:color="FFFFFF" w:sz="0"/>
+              <w:bottom w:val="none" w:color="FFFFFF" w:sz="0"/>
+              <w:right w:val="none" w:color="FFFFFF" w:sz="0"/>
+            </w:tcBorders>
+            <w:shd w:fill="FAF3E0" w:color="auto" w:val="clear"/>
+            <w:tcMar>
+              <w:top w:type="dxa" w:w="40"/>
+              <w:left w:type="dxa" w:w="80"/>
+              <w:bottom w:type="dxa" w:w="40"/>
+              <w:right w:type="dxa" w:w="80"/>
+            </w:tcMar>
+            <w:vAlign w:val="center"/>
+          </w:tcPr>
+          <w:p>
+            <w:pPr>
+              <w:jc w:val="center"/>
+            </w:pPr>
+            <w:r>
+              <w:rPr>
+                <w:rFonts w:ascii="Arial" w:cs="Arial" w:eastAsia="Arial" w:hAnsi="Arial"/>
+                <w:color w:val="6B6B6B"/>
+                <w:sz w:val="15"/>
+                <w:szCs w:val="15"/>
+              </w:rPr>
+              <w:t xml:space="preserve">60s</w:t>
+            </w:r>
+          </w:p>
+        </w:tc>
+        <w:tc>
+          <w:tcPr>
+            <w:tcW w:type="dxa" w:w="5580"/>
+            <w:tcBorders>
+              <w:top w:val="none" w:color="FFFFFF" w:sz="0"/>
+              <w:left w:val="none" w:color="FFFFFF" w:sz="0"/>
+              <w:bottom w:val="none" w:color="FFFFFF" w:sz="0"/>
+              <w:right w:val="none" w:color="FFFFFF" w:sz="0"/>
+            </w:tcBorders>
+            <w:shd w:fill="FAF3E0" w:color="auto" w:val="clear"/>
+            <w:tcMar>
+              <w:top w:type="dxa" w:w="40"/>
+              <w:left w:type="dxa" w:w="80"/>
+              <w:bottom w:type="dxa" w:w="40"/>
+              <w:right w:type="dxa" w:w="80"/>
+            </w:tcMar>
+            <w:vAlign w:val="center"/>
+          </w:tcPr>
+          <w:p>
+            <w:r>
+              <w:rPr>
+                <w:rFonts w:ascii="Arial" w:cs="Arial" w:eastAsia="Arial" w:hAnsi="Arial"/>
+                <w:color w:val="6B6B6B"/>
+                <w:sz w:val="17"/>
+                <w:szCs w:val="17"/>
+              </w:rPr>
+              <w:t xml:space="preserve">New this update. Overhead isometric hold while walking — shoulder stability, thoracic extension, core anti-extension, and gait control combined. PT-framed as direct running-economy transfer.</w:t>
             </w:r>
           </w:p>
         </w:tc>

</xml_diff>

<commit_message>
Checkpoint: Block Method batch 3 in progress (Nancy + Rena built, August mid-edit, Petra pending)
Session-limit interruption checkpoint — not audited, not delivered.

Co-Authored-By: Claude Fable 5 <noreply@anthropic.com>
Claude-Session: https://claude.ai/code/session_01VTRA12TAy4P16NRVKS4SK5
</commit_message>
<xml_diff>
--- a/clients/nancy_avitable/Nancy_Avitable_3Day_Training_Plan.docx
+++ b/clients/nancy_avitable/Nancy_Avitable_3Day_Training_Plan.docx
@@ -1366,7 +1366,7 @@
                 <w:sz w:val="16"/>
                 <w:szCs w:val="16"/>
               </w:rPr>
-              <w:t xml:space="preserve">Reference baseline only — no matching slot; NOT used to inform Romanian Deadlift (mechanically distinct lift, different load capacity). Revisit if a dedicated hex-bar deadlift slot is added.</w:t>
+              <w:t xml:space="preserve">Reference baseline only — deliberately NOT used to set the Romanian Deadlift load (mechanically distinct lift, different load capacity). Revisit if a dedicated hex-bar deadlift is added to the program.</w:t>
             </w:r>
           </w:p>
         </w:tc>
@@ -1508,7 +1508,7 @@
                 <w:sz w:val="16"/>
                 <w:szCs w:val="16"/>
               </w:rPr>
-              <w:t xml:space="preserve">Reference baseline only — no existing press slot beyond Incline DB Press; not force-fit as a 3rd pressing exercise.</w:t>
+              <w:t xml:space="preserve">Reference baseline only — Incline DB Press covers the week's pressing progression; a third pressing exercise is not force-fit in.</w:t>
             </w:r>
           </w:p>
         </w:tc>
@@ -1792,7 +1792,7 @@
                 <w:sz w:val="16"/>
                 <w:szCs w:val="16"/>
               </w:rPr>
-              <w:t xml:space="preserve">Reference baseline only — no plank slot in current 3-day structure.</w:t>
+              <w:t xml:space="preserve">Reference baseline only — not currently a programmed exercise in this 3-day plan.</w:t>
             </w:r>
           </w:p>
         </w:tc>
@@ -1934,7 +1934,7 @@
                 <w:sz w:val="16"/>
                 <w:szCs w:val="16"/>
               </w:rPr>
-              <w:t xml:space="preserve">Reference baseline only — no push-up slot in current 3-day structure.</w:t>
+              <w:t xml:space="preserve">Reference baseline only — not currently a programmed exercise in this 3-day plan.</w:t>
             </w:r>
           </w:p>
         </w:tc>
@@ -2076,7 +2076,7 @@
                 <w:sz w:val="16"/>
                 <w:szCs w:val="16"/>
               </w:rPr>
-              <w:t xml:space="preserve">Reference baseline only — bonus 11th ICONS protocol movement; no pull-up slot in current structure.</w:t>
+              <w:t xml:space="preserve">Reference baseline only — bonus 11th ICONS protocol movement; not currently a programmed exercise in this 3-day plan.</w:t>
             </w:r>
           </w:p>
         </w:tc>
@@ -2234,7 +2234,7 @@
           <w:sz w:val="17"/>
           <w:szCs w:val="17"/>
         </w:rPr>
-        <w:t xml:space="preserve">No exercise literally named "Split Squat" exists in Nancy's program. Weighted Step-Up (Day 3 Block B, a primary-strength-block loaded unilateral knee-dominant movement) is the closest analogous slot — closer than Day 1's Reverse Lunge or Day 3's Curtsy Lunge, both of which are deliberately light, corrective-context finishers where a heavier baseline-derived load would work against their actual purpose. The DB Split Squat baseline (17.5 lbs/hand → 20 lbs/hand) is used to inform Weighted Step-Up's Week 1 → Week 4 load on that basis.</w:t>
+        <w:t xml:space="preserve">No exercise literally named "Split Squat" exists in Nancy's program. Weighted Step-Up (Day 3 Block C as of the 8/19 restructure, a loaded unilateral knee-dominant movement) is the closest analogous slot — closer than Day 1's Reverse Lunge or Day 3's Curtsy Lunge, both of which are deliberately light, corrective-context finishers where a heavier baseline-derived load would work against their actual purpose. The DB Split Squat baseline (17.5 lbs/hand → 20 lbs/hand) is used to inform Weighted Step-Up's Week 1 → Week 4 load on that basis.</w:t>
       </w:r>
     </w:p>
     <w:p>

</xml_diff>